<commit_message>
barlow/finesst: restyle assistant-authored passages to match FI's v1 voice
Analyzed the FI's original v1 draft: short declarative sentences, one
idea each, first person, plain concrete verbs, parenthetical
definitions, no colon-chained clauses or em-dash asides. The six
passages I had authored (division/program sentence, hypothesis
falsification clause, and the four v10 additions) did not match -
rewritten in that register in v10 + v10_tracked. Content and meaning
unchanged; edits stay inside their original tracked-insertion
attribution; accept-all(v10_tracked) == v10 re-verified; S/T/M still
ends on p6.

Co-Authored-By: Claude Fable 5 <noreply@anthropic.com>
</commit_message>
<xml_diff>
--- a/barlow/docs/finesst_proposal_v10.docx
+++ b/barlow/docs/finesst_proposal_v10.docx
@@ -340,7 +340,7 @@
         <w:t xml:space="preserve">The </w:t>
       </w:r>
       <w:r>
-        <w:t xml:space="preserve">proposed research is relevant to NASA’s Earth Science Division — most directly the Cryospheric Sciences and Terrestrial Hydrology programs, which support research on cold-region surface change and meltwater hydrology. The </w:t>
+        <w:t xml:space="preserve">project sits in NASA’s Earth Science Division. The closest programs are Cryospheric Sciences and Terrestrial Hydrology, and both fund work on cold-region surface change and meltwater. The </w:t>
       </w:r>
       <w:r>
         <w:t xml:space="preserve">2001 baseline is NASA data — an airborne </w:t>
@@ -432,7 +432,7 @@
         <w:t xml:space="preserve"> better than water volume alone. The hypothesis is testable: if discharge alone </w:t>
       </w:r>
       <w:r>
-        <w:t xml:space="preserve">predicts channel migration as well as or better than melt energy,</w:t>
+        <w:t xml:space="preserve">predicts channel migration as well as melt energy does,</w:t>
       </w:r>
       <w:r>
         <w:t xml:space="preserve"> the hypothesis fails.</w:t>
@@ -648,7 +648,7 @@
         <w:t xml:space="preserve">Build each stream's driver history from MDV-LTER station records, filling coverage gaps with the ERA5 and AMPS weather models.</w:t>
       </w:r>
       <w:r>
-        <w:t xml:space="preserve"> Where gauge records are missing or end early, estimate discharge from sunlight: fit a regression between measured discharge and summer insolation on each gauged stream's source glacier, then apply it to ungauged streams. This extends the analysis beyond the 21 gauged streams and fills the thin post-2015 record.</w:t>
+        <w:t xml:space="preserve"> Some streams have no gauge and some gauges stopped recording early. For those, estimate discharge from sunlight. Fit a regression between measured discharge and the summer insolation on each gauged stream's source glacier, then apply it to the ungauged streams. That pushes the analysis past the 21 gauged streams and fills in the thin record after 2015.</w:t>
       </w:r>
     </w:p>
     <w:p>
@@ -697,7 +697,7 @@
         <w:t xml:space="preserve">Apply the objective-3 per-pixel thresholds along the stream corridor and pull out each change patch as a connected group of super-threshold pixels, dropping patches below a minimum mapping unit to suppress isolated-pixel noise. Bedrock and stable soils flanking the corridor supply the fixed reference used to co-register the sensors, so change is measured against genuinely stable ground.</w:t>
       </w:r>
       <w:r>
-        <w:t xml:space="preserve"> Stable ground is defined operationally, not assumed: the areas the channel detector classifies as non-stream in every epoch form the reference surface.</w:t>
+        <w:t xml:space="preserve"> Stable ground is not a judgment call here. It is any area the channel detector marks as non-stream in every epoch, and that computed surface is the reference.</w:t>
       </w:r>
     </w:p>
     <w:p>
@@ -782,7 +782,7 @@
         <w:t xml:space="preserve">Publish it as a per-pixel threshold map and verify the 5%-on-stable-ground property.</w:t>
       </w:r>
       <w:r>
-        <w:t xml:space="preserve"> As an independent check, difference a 2014 REMA DEM against the 2014 lidar DEM: both map the same year, so true change is zero and every residual is sensor error. This calibrates the noise model without assuming which surfaces are stable.</w:t>
+        <w:t xml:space="preserve"> There is also a check that assumes nothing about stable ground. Difference a 2014 REMA DEM against the 2014 lidar DEM. Both map the same year, so the true change is zero. Whatever is left over is sensor error, and that is what calibrates the noise model.</w:t>
       </w:r>
       <w:commentRangeEnd w:id="95"/>
       <w:r>
@@ -1527,7 +1527,7 @@
         <w:t xml:space="preserve">Gauge records are patchy after 2015. Stream gauging in the MDVs declined, and some streams have only a few dozen recorded days in the satellite epoch. This is why objective 1 leans on modeled melt energy rather than gauges alone — though it means the discharge side of the hypothesis is weakest in the most recent period.</w:t>
       </w:r>
       <w:r>
-        <w:t xml:space="preserve"> The insolation-to-discharge regression in objective 1 partially restores that side: gauged years calibrate the proxy, which then covers ungauged streams and seasons.</w:t>
+        <w:t xml:space="preserve"> The sunlight-to-discharge regression in objective 1 buys part of that back. The gauged years teach the proxy, and the proxy then covers the ungauged streams and seasons.</w:t>
       </w:r>
     </w:p>
     <w:p>

</xml_diff>

<commit_message>
barlow/finesst: state H2 in O2 + tag H1 (completes Glennie comment #6)
Audit of "reformulate as hypotheses" found O2 still task-framed (all
task verbs, no falsifiable claim) and Figure 2's "driver fingerprints
(H2)" box dangling - no H2 existed in the text. Added the process-
fingerprint hypothesis to O2 with its kill condition, and tagged O1's
existing hypothesis (H1) for coherent numbering. O3 left method-framed
on purpose (falsifiable 5% success test + zero-change check).

Tracked insertions in v10_tracked; accept-all == v10 verified; H2
renders on p2; S/T/M still ends on p6.

Co-Authored-By: Claude Fable 5 <noreply@anthropic.com>
</commit_message>
<xml_diff>
--- a/barlow/docs/finesst_proposal_v10.docx
+++ b/barlow/docs/finesst_proposal_v10.docx
@@ -429,7 +429,13 @@
         <w:t xml:space="preserve">channel change</w:t>
       </w:r>
       <w:r>
-        <w:t xml:space="preserve"> better than water volume alone. The hypothesis is testable: if discharge alone </w:t>
+        <w:t xml:space="preserve"> better than water volume alone</w:t>
+      </w:r>
+      <w:r>
+        <w:t xml:space="preserve"> (H1)</w:t>
+      </w:r>
+      <w:r>
+        <w:t xml:space="preserve">. The hypothesis is testable: if discharge alone </w:t>
       </w:r>
       <w:r>
         <w:t xml:space="preserve">predicts channel migration as well as melt energy does,</w:t>
@@ -451,29 +457,11 @@
           <w:szCs w:val="24"/>
         </w:rPr>
       </w:r>
-      <w:r/>
-      <w:r/>
-      <w:r/>
-      <w:r/>
-      <w:r/>
-      <w:r/>
-      <w:r/>
-      <w:r/>
-      <w:r/>
-      <w:r/>
-      <w:r/>
-    </w:p>
-    <w:p>
-      <w:pPr>
-        <w:pStyle w:val="ListParagraph"/>
-        <w:numPr>
-          <w:ilvl w:val="0"/>
-          <w:numId w:val="3"/>
-        </w:numPr>
-      </w:pPr>
-      <w:commentRangeStart w:id="92"/>
-      <w:r>
-        <w:t>Process attribution along the stream corridor. Beyond the channel centerline, classify change in the near-channel corridor — channel shift and avulsion, bank thaw and subsidence, and fan growth — by process type. Bedrock and stable soils outside the corridor provide the fixed reference used to georeference the REMA satellite DEM to the airborne lidar, so change is measured against genuinely stable ground rather than an assumption that the whole surface is moving.</w:t>
+      <w:r>
+        <w:t xml:space="preserve">Process attribution along the stream corridor. Beyond the channel centerline, classify change in the near-channel corridor — channel shift and avulsion, bank thaw and subsidence, and fan growth — by process type. Bedrock and stable soils outside the corridor provide the fixed reference used to georeference the REMA satellite DEM to the airborne lidar, so change is measured against genuinely stable ground rather than an assumption that the whole surface is moving.</w:t>
+      </w:r>
+      <w:r>
+        <w:t xml:space="preserve"> We expect each process type to carry its own driver fingerprint. Bank thaw should track summer thaw, channel shift should track peak discharge, and fan growth should follow both (H2). If every process type responds to the drivers the same way, the fingerprint idea fails and the classification carries no explanatory weight.</w:t>
       </w:r>
       <w:commentRangeEnd w:id="92"/>
       <w:r>

</xml_diff>